<commit_message>
feat(v2): add Support & Resistance quant lab, 5Y empirical bounce backtester, and 34-parameter inspector to Tab 4
</commit_message>
<xml_diff>
--- a/AGY_Quant_Platform_V2_Guide.docx
+++ b/AGY_Quant_Platform_V2_Guide.docx
@@ -26,7 +26,7 @@
           <w:color w:val="64748B"/>
           <w:sz w:val="20"/>
         </w:rPr>
-        <w:t xml:space="preserve">Public Testbed Edition • High-Conviction Tactical Engine • Generated on: September 26, 2026 - 11:16 AM IST</w:t>
+        <w:t xml:space="preserve">Public Testbed Edition • High-Conviction Tactical Engine • Generated on: September 26, 2026 - 12:49 PM IST</w:t>
       </w:r>
     </w:p>
     <w:p>
@@ -2856,13 +2856,13 @@
           <w:b/>
           <w:color w:val="0F172A"/>
         </w:rPr>
-        <w:t xml:space="preserve">Weekday Schedule Guard: </w:t>
+        <w:t xml:space="preserve">Schedule Guard: </w:t>
       </w:r>
       <w:r>
         <w:rPr>
           <w:color w:val="334155"/>
         </w:rPr>
-        <w:t xml:space="preserve">Automated cron background tasks run strictly on weekdays (Mon-Fri) and safely bypass weekends.</w:t>
+        <w:t xml:space="preserve">Configurable schedule guard (unlocked 7 days/week in testbed for full simulation).</w:t>
       </w:r>
     </w:p>
     <w:p>
@@ -2913,6 +2913,144 @@
           <w:color w:val="334155"/>
         </w:rPr>
         <w:t xml:space="preserve">Chronological audit trail logging every manual adjustment, AI auto-tune, and baseline reset.</w:t>
+      </w:r>
+    </w:p>
+    <w:p>
+      <w:pPr>
+        <w:spacing w:after="120"/>
+      </w:pPr>
+      <w:r>
+        <w:rPr>
+          <w:b/>
+          <w:color w:val="1E3A8A"/>
+          <w:sz w:val="30"/>
+        </w:rPr>
+        <w:t xml:space="preserve">10. Support, Resistance &amp; Range-Bound Quant Lab (Tab 4)</w:t>
+      </w:r>
+    </w:p>
+    <w:p>
+      <w:pPr>
+        <w:spacing w:after="80"/>
+        <w:ind w:left="360" w:hanging="240"/>
+      </w:pPr>
+      <w:r>
+        <w:rPr>
+          <w:color w:val="2563EB"/>
+        </w:rPr>
+        <w:t>• </w:t>
+      </w:r>
+      <w:r>
+        <w:rPr>
+          <w:b/>
+          <w:color w:val="0F172A"/>
+        </w:rPr>
+        <w:t xml:space="preserve">Algorithmic S/R Detection: </w:t>
+      </w:r>
+      <w:r>
+        <w:rPr>
+          <w:color w:val="334155"/>
+        </w:rPr>
+        <w:t xml:space="preserve">Detects Immediate Support (S1), Structural Floor (S2), Immediate Resistance (R1), Structural Ceiling (R2), and Channel Midline.</w:t>
+      </w:r>
+    </w:p>
+    <w:p>
+      <w:pPr>
+        <w:spacing w:after="80"/>
+        <w:ind w:left="360" w:hanging="240"/>
+      </w:pPr>
+      <w:r>
+        <w:rPr>
+          <w:color w:val="2563EB"/>
+        </w:rPr>
+        <w:t>• </w:t>
+      </w:r>
+      <w:r>
+        <w:rPr>
+          <w:b/>
+          <w:color w:val="0F172A"/>
+        </w:rPr>
+        <w:t xml:space="preserve">Range Regime &amp; Signals: </w:t>
+      </w:r>
+      <w:r>
+        <w:rPr>
+          <w:color w:val="334155"/>
+        </w:rPr>
+        <w:t xml:space="preserve">ADX &lt; 22 and Choppiness Index identify consolidation boxes. Generates BUY AT SUPPORT, SELL AT RESISTANCE, and BREAKOUT RUNNER signals.</w:t>
+      </w:r>
+    </w:p>
+    <w:p>
+      <w:pPr>
+        <w:spacing w:after="80"/>
+        <w:ind w:left="360" w:hanging="240"/>
+      </w:pPr>
+      <w:r>
+        <w:rPr>
+          <w:color w:val="2563EB"/>
+        </w:rPr>
+        <w:t>• </w:t>
+      </w:r>
+      <w:r>
+        <w:rPr>
+          <w:b/>
+          <w:color w:val="0F172A"/>
+        </w:rPr>
+        <w:t xml:space="preserve">5-Year Empirical Backtest: </w:t>
+      </w:r>
+      <w:r>
+        <w:rPr>
+          <w:color w:val="334155"/>
+        </w:rPr>
+        <w:t xml:space="preserve">Simulates 5-6 years of daily data (~1,250 bars) for support bounces. Measures Win Rate %, Average PnL %, and Profit Factor.</w:t>
+      </w:r>
+    </w:p>
+    <w:p>
+      <w:pPr>
+        <w:spacing w:after="80"/>
+        <w:ind w:left="360" w:hanging="240"/>
+      </w:pPr>
+      <w:r>
+        <w:rPr>
+          <w:color w:val="2563EB"/>
+        </w:rPr>
+        <w:t>• </w:t>
+      </w:r>
+      <w:r>
+        <w:rPr>
+          <w:b/>
+          <w:color w:val="0F172A"/>
+        </w:rPr>
+        <w:t xml:space="preserve">Predictability Leaderboard: </w:t>
+      </w:r>
+      <w:r>
+        <w:rPr>
+          <w:color w:val="334155"/>
+        </w:rPr>
+        <w:t xml:space="preserve">Ranks the universe by S/R fidelity (e.g. Cholamandalam 84.6%, Gold BeES 71.4%, Maruti 61.5%, ITC 56.5%).</w:t>
+      </w:r>
+    </w:p>
+    <w:p>
+      <w:pPr>
+        <w:spacing w:after="80"/>
+        <w:ind w:left="360" w:hanging="240"/>
+      </w:pPr>
+      <w:r>
+        <w:rPr>
+          <w:color w:val="2563EB"/>
+        </w:rPr>
+        <w:t>• </w:t>
+      </w:r>
+      <w:r>
+        <w:rPr>
+          <w:b/>
+          <w:color w:val="0F172A"/>
+        </w:rPr>
+        <w:t xml:space="preserve">34-Parameter Deep Dive: </w:t>
+      </w:r>
+      <w:r>
+        <w:rPr>
+          <w:color w:val="334155"/>
+        </w:rPr>
+        <w:t xml:space="preserve">Complete parameter laboratory showing all 34 technical, quantitative, momentum, and fundamental metrics for any selected asset.</w:t>
       </w:r>
     </w:p>
     <w:p>

</xml_diff>

<commit_message>
feat(v2): add dynamic universe analyzer and 1-click expansion to NIFTY 250 stocks and non-sectoral ETFs across all tabs
</commit_message>
<xml_diff>
--- a/AGY_Quant_Platform_V2_Guide.docx
+++ b/AGY_Quant_Platform_V2_Guide.docx
@@ -26,7 +26,7 @@
           <w:color w:val="64748B"/>
           <w:sz w:val="20"/>
         </w:rPr>
-        <w:t xml:space="preserve">Public Testbed Edition • High-Conviction Tactical Engine • Generated on: September 26, 2026 - 01:14 PM IST</w:t>
+        <w:t xml:space="preserve">Public Testbed Edition • High-Conviction Tactical Engine • Generated on: September 26, 2026 - 01:28 PM IST</w:t>
       </w:r>
     </w:p>
     <w:p>
@@ -3101,6 +3101,119 @@
           <w:color w:val="334155"/>
         </w:rPr>
         <w:t xml:space="preserve">Complete parameter laboratory showing all 34 technical, quantitative, momentum, and fundamental metrics for any selected asset.</w:t>
+      </w:r>
+    </w:p>
+    <w:p>
+      <w:pPr>
+        <w:spacing w:after="120"/>
+      </w:pPr>
+      <w:r>
+        <w:rPr>
+          <w:b/>
+          <w:color w:val="1E3A8A"/>
+          <w:sz w:val="30"/>
+        </w:rPr>
+        <w:t xml:space="preserve">11. Universe Intelligence &amp; Dynamic NIFTY 250 / Non-Sectoral Expansion</w:t>
+      </w:r>
+    </w:p>
+    <w:p>
+      <w:pPr>
+        <w:spacing w:after="80"/>
+        <w:ind w:left="360" w:hanging="240"/>
+      </w:pPr>
+      <w:r>
+        <w:rPr>
+          <w:color w:val="2563EB"/>
+        </w:rPr>
+        <w:t>• </w:t>
+      </w:r>
+      <w:r>
+        <w:rPr>
+          <w:b/>
+          <w:color w:val="0F172A"/>
+        </w:rPr>
+        <w:t xml:space="preserve">Universal 1-Click Expansion: </w:t>
+      </w:r>
+      <w:r>
+        <w:rPr>
+          <w:color w:val="334155"/>
+        </w:rPr>
+        <w:t xml:space="preserve">One-click button in the Sidebar and Tab 1 expands the universe from 87 assets to 297 assets (250 Large &amp; Midcaps + 47 Non-Sectoral ETFs) across all tabs.</w:t>
+      </w:r>
+    </w:p>
+    <w:p>
+      <w:pPr>
+        <w:spacing w:after="80"/>
+        <w:ind w:left="360" w:hanging="240"/>
+      </w:pPr>
+      <w:r>
+        <w:rPr>
+          <w:color w:val="2563EB"/>
+        </w:rPr>
+        <w:t>• </w:t>
+      </w:r>
+      <w:r>
+        <w:rPr>
+          <w:b/>
+          <w:color w:val="0F172A"/>
+        </w:rPr>
+        <w:t xml:space="preserve">NIFTY LargeMidcap 250 Coverage: </w:t>
+      </w:r>
+      <w:r>
+        <w:rPr>
+          <w:color w:val="334155"/>
+        </w:rPr>
+        <w:t xml:space="preserve">Covers the top 100 largecaps and 150 high-conviction midcaps across 16 economic sectors (Industrials, Defense, IT, Banking, Auto, Pharma, FMCG, Power, Chemicals, EMS, QSR, Realty).</w:t>
+      </w:r>
+    </w:p>
+    <w:p>
+      <w:pPr>
+        <w:spacing w:after="80"/>
+        <w:ind w:left="360" w:hanging="240"/>
+      </w:pPr>
+      <w:r>
+        <w:rPr>
+          <w:color w:val="2563EB"/>
+        </w:rPr>
+        <w:t>• </w:t>
+      </w:r>
+      <w:r>
+        <w:rPr>
+          <w:b/>
+          <w:color w:val="0F172A"/>
+        </w:rPr>
+        <w:t xml:space="preserve">Macro Non-Sectoral ETF Guarantee: </w:t>
+      </w:r>
+      <w:r>
+        <w:rPr>
+          <w:color w:val="334155"/>
+        </w:rPr>
+        <w:t xml:space="preserve">Curated strictly to broad market indices (Nifty 50, Next 50, Midcap 150, Smallcap 250, 500), factor/smart-beta (Alpha, Quality, Momentum, Low Vol, Value, Equal Weight), commodities (Gold/Silver), and global equities (Nasdaq, S&amp;P 500). Sectoral bets are excluded to avoid cyclical concentration.</w:t>
+      </w:r>
+    </w:p>
+    <w:p>
+      <w:pPr>
+        <w:spacing w:after="80"/>
+        <w:ind w:left="360" w:hanging="240"/>
+      </w:pPr>
+      <w:r>
+        <w:rPr>
+          <w:color w:val="2563EB"/>
+        </w:rPr>
+        <w:t>• </w:t>
+      </w:r>
+      <w:r>
+        <w:rPr>
+          <w:b/>
+          <w:color w:val="0F172A"/>
+        </w:rPr>
+        <w:t xml:space="preserve">Persistent Configuration: </w:t>
+      </w:r>
+      <w:r>
+        <w:rPr>
+          <w:color w:val="334155"/>
+        </w:rPr>
+        <w:t xml:space="preserve">State persists cleanly in runtime_config.json and universe_config.json across browser reloads, background daemon sessions, and automated cron execution.</w:t>
       </w:r>
     </w:p>
     <w:p>

</xml_diff>

<commit_message>
feat(v2): integrate interactive Telegram bot testing lab, S/R alert dispatch, and execution notifications
</commit_message>
<xml_diff>
--- a/AGY_Quant_Platform_V2_Guide.docx
+++ b/AGY_Quant_Platform_V2_Guide.docx
@@ -26,7 +26,7 @@
           <w:color w:val="64748B"/>
           <w:sz w:val="20"/>
         </w:rPr>
-        <w:t xml:space="preserve">Public Testbed Edition • High-Conviction Tactical Engine • Generated on: September 26, 2026 - 01:28 PM IST</w:t>
+        <w:t xml:space="preserve">Public Testbed Edition • High-Conviction Tactical Engine • Generated on: September 26, 2026 - 01:45 PM IST</w:t>
       </w:r>
     </w:p>
     <w:p>
@@ -3214,6 +3214,119 @@
           <w:color w:val="334155"/>
         </w:rPr>
         <w:t xml:space="preserve">State persists cleanly in runtime_config.json and universe_config.json across browser reloads, background daemon sessions, and automated cron execution.</w:t>
+      </w:r>
+    </w:p>
+    <w:p>
+      <w:pPr>
+        <w:spacing w:after="120"/>
+      </w:pPr>
+      <w:r>
+        <w:rPr>
+          <w:b/>
+          <w:color w:val="1E3A8A"/>
+          <w:sz w:val="30"/>
+        </w:rPr>
+        <w:t xml:space="preserve">12. Telegram Alert Testing &amp; Integration Lab (Tab 4 &amp; Tab 5)</w:t>
+      </w:r>
+    </w:p>
+    <w:p>
+      <w:pPr>
+        <w:spacing w:after="80"/>
+        <w:ind w:left="360" w:hanging="240"/>
+      </w:pPr>
+      <w:r>
+        <w:rPr>
+          <w:color w:val="2563EB"/>
+        </w:rPr>
+        <w:t>• </w:t>
+      </w:r>
+      <w:r>
+        <w:rPr>
+          <w:b/>
+          <w:color w:val="0F172A"/>
+        </w:rPr>
+        <w:t xml:space="preserve">S/R Lab Alert Testing Studio: </w:t>
+      </w:r>
+      <w:r>
+        <w:rPr>
+          <w:color w:val="334155"/>
+        </w:rPr>
+        <w:t xml:space="preserve">Integrated directly into the S/R Range-Bound Lab (Tab 4) with one-click buttons to dispatch formatted S/R support bounce alerts and multi-factor diagnostics directly to Telegram.</w:t>
+      </w:r>
+    </w:p>
+    <w:p>
+      <w:pPr>
+        <w:spacing w:after="80"/>
+        <w:ind w:left="360" w:hanging="240"/>
+      </w:pPr>
+      <w:r>
+        <w:rPr>
+          <w:color w:val="2563EB"/>
+        </w:rPr>
+        <w:t>• </w:t>
+      </w:r>
+      <w:r>
+        <w:rPr>
+          <w:b/>
+          <w:color w:val="0F172A"/>
+        </w:rPr>
+        <w:t xml:space="preserve">Automated Execution &amp; Exit Alerts: </w:t>
+      </w:r>
+      <w:r>
+        <w:rPr>
+          <w:color w:val="334155"/>
+        </w:rPr>
+        <w:t xml:space="preserve">Executing paper trades from Tab 4 or via the automated daemon dispatches instantaneous trade notifications (Ticker, Entry CMP, Qty, Target, Stop Loss) to Telegram.</w:t>
+      </w:r>
+    </w:p>
+    <w:p>
+      <w:pPr>
+        <w:spacing w:after="80"/>
+        <w:ind w:left="360" w:hanging="240"/>
+      </w:pPr>
+      <w:r>
+        <w:rPr>
+          <w:color w:val="2563EB"/>
+        </w:rPr>
+        <w:t>• </w:t>
+      </w:r>
+      <w:r>
+        <w:rPr>
+          <w:b/>
+          <w:color w:val="0F172A"/>
+        </w:rPr>
+        <w:t xml:space="preserve">Full Configuration &amp; Diagnostic Hub: </w:t>
+      </w:r>
+      <w:r>
+        <w:rPr>
+          <w:color w:val="334155"/>
+        </w:rPr>
+        <w:t xml:space="preserve">Dedicated Telegram Center in Tab 5 provides credentials management, getMe API connectivity tests, live custom test dispatchers, and setup instructions.</w:t>
+      </w:r>
+    </w:p>
+    <w:p>
+      <w:pPr>
+        <w:spacing w:after="80"/>
+        <w:ind w:left="360" w:hanging="240"/>
+      </w:pPr>
+      <w:r>
+        <w:rPr>
+          <w:color w:val="2563EB"/>
+        </w:rPr>
+        <w:t>• </w:t>
+      </w:r>
+      <w:r>
+        <w:rPr>
+          <w:b/>
+          <w:color w:val="0F172A"/>
+        </w:rPr>
+        <w:t xml:space="preserve">Persistence &amp; Multi-Environment Support: </w:t>
+      </w:r>
+      <w:r>
+        <w:rPr>
+          <w:color w:val="334155"/>
+        </w:rPr>
+        <w:t xml:space="preserve">Credentials and alert preferences persist in runtime_config.json with zero code modifications needed.</w:t>
       </w:r>
     </w:p>
     <w:p>

</xml_diff>